<commit_message>
Record the second-order defect and the verified production figures
Co-Authored-By: Claude Opus 5 <noreply@anthropic.com>
Claude-Session: https://claude.ai/code/session_01W9UtE7X76spacWeSvBH7tv
</commit_message>
<xml_diff>
--- a/CONVERSION_DIAGNOSTIC_REPORT.docx
+++ b/CONVERSION_DIAGNOSTIC_REPORT.docx
@@ -5485,11 +5485,145 @@
           </w:p>
         </w:tc>
       </w:tr>
+      <w:tr>
+        <w:tc>
+          <w:tcPr>
+            <w:tcW w:w="2340" w:type="dxa"/>
+          </w:tcPr>
+          <w:p>
+            <w:pPr>
+              <w:spacing w:after="0"/>
+            </w:pPr>
+            <w:r>
+              <w:t xml:space="preserve">The fix above did not work on first deploy</w:t>
+            </w:r>
+          </w:p>
+        </w:tc>
+        <w:tc>
+          <w:tcPr>
+            <w:tcW w:w="2340" w:type="dxa"/>
+          </w:tcPr>
+          <w:p>
+            <w:pPr>
+              <w:spacing w:after="0"/>
+            </w:pPr>
+            <w:r>
+              <w:rPr>
+                <w:rFonts w:ascii="Consolas" w:hAnsi="Consolas"/>
+              </w:rPr>
+              <w:t xml:space="preserve">api/gate-stats.js</w:t>
+            </w:r>
+          </w:p>
+        </w:tc>
+        <w:tc>
+          <w:tcPr>
+            <w:tcW w:w="2340" w:type="dxa"/>
+          </w:tcPr>
+          <w:p>
+            <w:pPr>
+              <w:spacing w:after="0"/>
+            </w:pPr>
+            <w:r>
+              <w:t xml:space="preserve">The events query selected </w:t>
+            </w:r>
+            <w:r>
+              <w:rPr>
+                <w:rFonts w:ascii="Consolas" w:hAnsi="Consolas"/>
+              </w:rPr>
+              <w:t xml:space="preserve">source, payload, created_at</w:t>
+            </w:r>
+            <w:r>
+              <w:t xml:space="preserve"> only, so </w:t>
+            </w:r>
+            <w:r>
+              <w:rPr>
+                <w:rFonts w:ascii="Consolas" w:hAnsi="Consolas"/>
+              </w:rPr>
+              <w:t xml:space="preserve">e.type</w:t>
+            </w:r>
+            <w:r>
+              <w:t xml:space="preserve"> was always undefined and the new guard never fired</w:t>
+            </w:r>
+          </w:p>
+        </w:tc>
+        <w:tc>
+          <w:tcPr>
+            <w:tcW w:w="2340" w:type="dxa"/>
+          </w:tcPr>
+          <w:p>
+            <w:pPr>
+              <w:spacing w:after="0"/>
+            </w:pPr>
+            <w:r>
+              <w:rPr>
+                <w:b/>
+              </w:rPr>
+              <w:t xml:space="preserve">Fixed.</w:t>
+            </w:r>
+            <w:r>
+              <w:t xml:space="preserve"> </w:t>
+            </w:r>
+            <w:r>
+              <w:rPr>
+                <w:rFonts w:ascii="Consolas" w:hAnsi="Consolas"/>
+              </w:rPr>
+              <w:t xml:space="preserve">type</w:t>
+            </w:r>
+            <w:r>
+              <w:t xml:space="preserve"> added to the select</w:t>
+            </w:r>
+          </w:p>
+        </w:tc>
+      </w:tr>
     </w:tbl>
     <w:p>
       <w:pPr/>
       <w:r>
         <w:t/>
+      </w:r>
+    </w:p>
+    <w:p>
+      <w:pPr>
+        <w:spacing w:after="140"/>
+      </w:pPr>
+      <w:r>
+        <w:t xml:space="preserve">The third row is worth keeping rather than tidying away. The first fix was logically correct, passed a syntax check, and changed nothing in production, because the column it tested was never fetched. It was caught only by reading the live endpoint after deploy and seeing </w:t>
+      </w:r>
+      <w:r>
+        <w:rPr>
+          <w:rFonts w:ascii="Consolas" w:hAnsi="Consolas"/>
+        </w:rPr>
+        <w:t xml:space="preserve">form_views</w:t>
+      </w:r>
+      <w:r>
+        <w:t xml:space="preserve"> still at 102 with </w:t>
+      </w:r>
+      <w:r>
+        <w:rPr>
+          <w:rFonts w:ascii="Consolas" w:hAnsi="Consolas"/>
+        </w:rPr>
+        <w:t xml:space="preserve">field_touches</w:t>
+      </w:r>
+      <w:r>
+        <w:t xml:space="preserve"> at 0. Verified after the second deploy: </w:t>
+      </w:r>
+      <w:r>
+        <w:rPr>
+          <w:rFonts w:ascii="Consolas" w:hAnsi="Consolas"/>
+        </w:rPr>
+        <w:t xml:space="preserve">form_views</w:t>
+      </w:r>
+      <w:r>
+        <w:t xml:space="preserve"> 101, </w:t>
+      </w:r>
+      <w:r>
+        <w:rPr>
+          <w:rFonts w:ascii="Consolas" w:hAnsi="Consolas"/>
+        </w:rPr>
+        <w:t xml:space="preserve">field_touches</w:t>
+      </w:r>
+      <w:r>
+        <w:t xml:space="preserve"> 1, reported separately.</w:t>
       </w:r>
     </w:p>
     <w:p>

</xml_diff>